<commit_message>
Add Copyright and Version
Update BRD Version
Added Footer to the Spreadsheet
</commit_message>
<xml_diff>
--- a/NeuByteTechnologies/FitnessApp/docs/BRD/Source Files/NeuByteFitnessAppBusinessRequirements.docx
+++ b/NeuByteTechnologies/FitnessApp/docs/BRD/Source Files/NeuByteFitnessAppBusinessRequirements.docx
@@ -6200,7 +6200,15 @@
         <w:br/>
       </w:r>
       <w:r>
-        <w:t>The system shall expire MFA codes after a defined time period.</w:t>
+        <w:t xml:space="preserve">The system shall expire MFA codes after a defined </w:t>
+      </w:r>
+      <w:proofErr w:type="gramStart"/>
+      <w:r>
+        <w:t>time period</w:t>
+      </w:r>
+      <w:proofErr w:type="gramEnd"/>
+      <w:r>
+        <w:t>.</w:t>
       </w:r>
     </w:p>
     <w:p>
@@ -14179,7 +14187,15 @@
         <w:br/>
       </w:r>
       <w:r>
-        <w:t>The system shall validate that the user has access to the selected workout program before displaying workout details.</w:t>
+        <w:t xml:space="preserve">The system shall validate that the user has access to the selected workout program before displaying </w:t>
+      </w:r>
+      <w:proofErr w:type="spellStart"/>
+      <w:r>
+        <w:t>workout</w:t>
+      </w:r>
+      <w:proofErr w:type="spellEnd"/>
+      <w:r>
+        <w:t xml:space="preserve"> details.</w:t>
       </w:r>
       <w:r>
         <w:br/>
@@ -17767,14 +17783,7 @@
           <w:b/>
           <w:bCs/>
         </w:rPr>
-        <w:t xml:space="preserve"> Default Notification Preferences</w:t>
-      </w:r>
-      <w:r>
-        <w:rPr>
-          <w:b/>
-          <w:bCs/>
-        </w:rPr>
-        <w:t xml:space="preserve"> </w:t>
+        <w:t xml:space="preserve"> Default Notification Preferences </w:t>
       </w:r>
       <w:r>
         <w:rPr>
@@ -19527,7 +19536,15 @@
         <w:t>‑</w:t>
       </w:r>
       <w:r>
-        <w:t>way hashing algorithm (bcrypt).</w:t>
+        <w:t>way hashing algorithm (</w:t>
+      </w:r>
+      <w:proofErr w:type="spellStart"/>
+      <w:r>
+        <w:t>bcrypt</w:t>
+      </w:r>
+      <w:proofErr w:type="spellEnd"/>
+      <w:r>
+        <w:t>).</w:t>
       </w:r>
     </w:p>
     <w:p>
@@ -26947,7 +26964,23 @@
                 <w:sz w:val="18"/>
                 <w:szCs w:val="18"/>
               </w:rPr>
-              <w:t>The hosting platform (e.g., Azure) used to deploy the application and store user data.</w:t>
+              <w:t xml:space="preserve">The hosting platform (e.g., Azure) </w:t>
+            </w:r>
+            <w:proofErr w:type="gramStart"/>
+            <w:r>
+              <w:rPr>
+                <w:sz w:val="18"/>
+                <w:szCs w:val="18"/>
+              </w:rPr>
+              <w:t>used</w:t>
+            </w:r>
+            <w:proofErr w:type="gramEnd"/>
+            <w:r>
+              <w:rPr>
+                <w:sz w:val="18"/>
+                <w:szCs w:val="18"/>
+              </w:rPr>
+              <w:t xml:space="preserve"> to deploy the application and store user data.</w:t>
             </w:r>
           </w:p>
           <w:p>
@@ -29647,7 +29680,23 @@
                 <w:sz w:val="18"/>
                 <w:szCs w:val="18"/>
               </w:rPr>
-              <w:t>A notification that has not yet marked as read and contributes to the unread count.</w:t>
+              <w:t xml:space="preserve">A notification that has not yet </w:t>
+            </w:r>
+            <w:proofErr w:type="gramStart"/>
+            <w:r>
+              <w:rPr>
+                <w:sz w:val="18"/>
+                <w:szCs w:val="18"/>
+              </w:rPr>
+              <w:t>marked</w:t>
+            </w:r>
+            <w:proofErr w:type="gramEnd"/>
+            <w:r>
+              <w:rPr>
+                <w:sz w:val="18"/>
+                <w:szCs w:val="18"/>
+              </w:rPr>
+              <w:t xml:space="preserve"> as read and contributes to the unread count.</w:t>
             </w:r>
           </w:p>
           <w:p>
@@ -30049,8 +30098,9 @@
     <w:pPr>
       <w:pStyle w:val="Footer"/>
       <w:tabs>
+        <w:tab w:val="clear" w:pos="4680"/>
         <w:tab w:val="clear" w:pos="9360"/>
-        <w:tab w:val="right" w:pos="10350"/>
+        <w:tab w:val="left" w:pos="3941"/>
       </w:tabs>
       <w:rPr>
         <w:rFonts w:ascii="Courier New" w:hAnsi="Courier New" w:cs="Courier New"/>
@@ -30059,6 +30109,15 @@
         <w:szCs w:val="16"/>
       </w:rPr>
     </w:pPr>
+    <w:r>
+      <w:rPr>
+        <w:rFonts w:ascii="Courier New" w:hAnsi="Courier New" w:cs="Courier New"/>
+        <w:color w:val="404040" w:themeColor="text1" w:themeTint="BF"/>
+        <w:sz w:val="16"/>
+        <w:szCs w:val="16"/>
+      </w:rPr>
+      <w:tab/>
+    </w:r>
   </w:p>
   <w:p>
     <w:pPr>
@@ -30185,6 +30244,24 @@
         <w:szCs w:val="16"/>
       </w:rPr>
       <w:t>Byte Technologies, All Rights Reserved</w:t>
+    </w:r>
+    <w:r>
+      <w:rPr>
+        <w:rFonts w:ascii="Cascadia Mono Light" w:hAnsi="Cascadia Mono Light" w:cs="Courier New"/>
+        <w:color w:val="404040" w:themeColor="text1" w:themeTint="BF"/>
+        <w:sz w:val="16"/>
+        <w:szCs w:val="16"/>
+      </w:rPr>
+      <w:t xml:space="preserve"> – Version: 1.</w:t>
+    </w:r>
+    <w:r>
+      <w:rPr>
+        <w:rFonts w:ascii="Cascadia Mono Light" w:hAnsi="Cascadia Mono Light" w:cs="Courier New"/>
+        <w:color w:val="404040" w:themeColor="text1" w:themeTint="BF"/>
+        <w:sz w:val="16"/>
+        <w:szCs w:val="16"/>
+      </w:rPr>
+      <w:t>1</w:t>
     </w:r>
     <w:r>
       <w:rPr>

</xml_diff>